<commit_message>
add Kim 2026 citations to posts 1 & 2; clean notebook; track post3 scratch
- Post 1 footnote 4: add Kim 2026 alongside Kardar (training dynamics vs inference-time framing)
- Post 2 limitations: add Kim 2026 parenthetical + footnote
- Post 2 notebook: delete debug cells (HookedTransformer repr, sys.executable); add log-n normalization note
- Track post3_feature-upgrade/scratch (experiments 1–16, figs, data arrays)

Co-Authored-By: Claude Sonnet 4.6 <noreply@anthropic.com>
</commit_message>
<xml_diff>
--- a/notebooks/anthropic_app/Fields_Peter_Resume_anthropic_final.docx
+++ b/notebooks/anthropic_app/Fields_Peter_Resume_anthropic_final.docx
@@ -212,50 +212,6 @@
       <w:r>
         <w:t>validated on the IOI circuit in GPT-2.</w:t>
       </w:r>
-    </w:p>
-    <w:p>
-      <w:pPr>
-        <w:numPr>
-          <w:ilvl w:val="0"/>
-          <w:numId w:val="1"/>
-        </w:numPr>
-        <w:spacing w:after="20" w:line="300" w:lineRule="auto"/>
-      </w:pPr>
-      <w:r>
-        <w:t xml:space="preserve">End-to-end modeling workflow: problem framing </w:t>
-      </w:r>
-      <w:r>
-        <w:rPr>
-          <w:rFonts w:ascii="Times New Roman" w:hAnsi="Times New Roman" w:cs="Times New Roman"/>
-        </w:rPr>
-        <w:t>→</w:t>
-      </w:r>
-      <w:r>
-        <w:t xml:space="preserve"> rapid prototyping </w:t>
-      </w:r>
-      <w:r>
-        <w:rPr>
-          <w:rFonts w:ascii="Times New Roman" w:hAnsi="Times New Roman" w:cs="Times New Roman"/>
-        </w:rPr>
-        <w:t>→</w:t>
-      </w:r>
-      <w:r>
-        <w:t xml:space="preserve"> metric design &amp; evaluation (held-out performance, ablations) </w:t>
-      </w:r>
-      <w:r>
-        <w:rPr>
-          <w:rFonts w:ascii="Times New Roman" w:hAnsi="Times New Roman" w:cs="Times New Roman"/>
-        </w:rPr>
-        <w:t>→</w:t>
-      </w:r>
-      <w:r>
-        <w:t xml:space="preserve"> reproducible research software and documentation.</w:t>
-      </w:r>
-    </w:p>
-    <w:p>
-      <w:pPr>
-        <w:spacing w:after="20" w:line="300" w:lineRule="auto"/>
-      </w:pPr>
     </w:p>
     <w:p>
       <w:pPr>
@@ -821,7 +777,6 @@
           <w:sz w:val="23"/>
           <w:szCs w:val="23"/>
         </w:rPr>
-        <w:lastRenderedPageBreak/>
         <w:t>EXPERIENCE</w:t>
       </w:r>
     </w:p>
@@ -857,6 +812,7 @@
           <w:sz w:val="19"/>
           <w:szCs w:val="19"/>
         </w:rPr>
+        <w:lastRenderedPageBreak/>
         <w:t>Data-driven modeling of proteins and neural-like systems using statistical physics and machine learning methods</w:t>
       </w:r>
     </w:p>

</xml_diff>